<commit_message>
feat: actualizar inventario completo con fotos frontales y cubrepatentes oficiales RG Motors
</commit_message>
<xml_diff>
--- a/documentos/01-Solicitud-Decisiones-y-Accesos-RGMotors-PuertoMontt.docx
+++ b/documentos/01-Solicitud-Decisiones-y-Accesos-RGMotors-PuertoMontt.docx
@@ -443,16 +443,7 @@
           <w:b/>
           <w:color w:val="2B6CB0"/>
         </w:rPr>
-        <w:t>1</w:t>
-      </w:r>
-      <w:proofErr w:type="gramStart"/>
-      <w:r>
-        <w:rPr>
-          <w:rFonts w:eastAsia="Calibri"/>
-          <w:b/>
-          <w:color w:val="2B6CB0"/>
-        </w:rPr>
-        <w:t xml:space="preserve">.  </w:t>
+        <w:t xml:space="preserve">1.  </w:t>
       </w:r>
       <w:r>
         <w:rPr>
@@ -460,16 +451,7 @@
           <w:b/>
           <w:color w:val="1A365D"/>
         </w:rPr>
-        <w:t>Objetivo</w:t>
-      </w:r>
-      <w:proofErr w:type="gramEnd"/>
-      <w:r>
-        <w:rPr>
-          <w:rFonts w:eastAsia="Calibri"/>
-          <w:b/>
-          <w:color w:val="1A365D"/>
-        </w:rPr>
-        <w:t xml:space="preserve"> del documento</w:t>
+        <w:t>Objetivo del documento</w:t>
       </w:r>
     </w:p>
     <w:p>
@@ -767,49 +749,7 @@
         <w:rPr>
           <w:rFonts w:eastAsia="Calibri"/>
         </w:rPr>
-        <w:t xml:space="preserve">El </w:t>
-      </w:r>
-      <w:proofErr w:type="spellStart"/>
-      <w:r>
-        <w:rPr>
-          <w:rFonts w:eastAsia="Calibri"/>
-        </w:rPr>
-        <w:t>presente</w:t>
-      </w:r>
-      <w:proofErr w:type="spellEnd"/>
-      <w:r>
-        <w:rPr>
-          <w:rFonts w:eastAsia="Calibri"/>
-        </w:rPr>
-        <w:t xml:space="preserve"> </w:t>
-      </w:r>
-      <w:proofErr w:type="spellStart"/>
-      <w:r>
-        <w:rPr>
-          <w:rFonts w:eastAsia="Calibri"/>
-        </w:rPr>
-        <w:t>documento</w:t>
-      </w:r>
-      <w:proofErr w:type="spellEnd"/>
-      <w:r>
-        <w:rPr>
-          <w:rFonts w:eastAsia="Calibri"/>
-        </w:rPr>
-        <w:t xml:space="preserve"> </w:t>
-      </w:r>
-      <w:proofErr w:type="spellStart"/>
-      <w:r>
-        <w:rPr>
-          <w:rFonts w:eastAsia="Calibri"/>
-        </w:rPr>
-        <w:t>tiene</w:t>
-      </w:r>
-      <w:proofErr w:type="spellEnd"/>
-      <w:r>
-        <w:rPr>
-          <w:rFonts w:eastAsia="Calibri"/>
-        </w:rPr>
-        <w:t xml:space="preserve"> por objeto formalizar las solicitudes y decisiones que la Empresa debe adoptar para continuar el desarrollo del sitio web de la sucursal Puerto Montt. Se busca evitar ambigüedades, retrasos por falta de insumos y conflictos de responsabilidad sobre costos, accesos y contratación de servicios.</w:t>
+        <w:t>El presente documento tiene por objeto formalizar las solicitudes y decisiones que la Empresa debe adoptar para continuar el desarrollo del sitio web de la sucursal Puerto Montt. Se busca evitar ambigüedades, retrasos por falta de insumos y conflictos de responsabilidad sobre costos, accesos y contratación de servicios.</w:t>
       </w:r>
     </w:p>
     <w:p>
@@ -907,18 +847,13 @@
         <w:rPr>
           <w:rFonts w:eastAsia="Calibri"/>
         </w:rPr>
-        <w:t>☐  Google Drive (recomendado) — carpeta compartida</w:t>
-      </w:r>
-    </w:p>
-    <w:p>
-      <w:pPr>
-        <w:spacing w:after="80"/>
-      </w:pPr>
+        <w:t>☐</w:t>
+      </w:r>
       <w:r>
         <w:rPr>
           <w:rFonts w:eastAsia="Calibri"/>
         </w:rPr>
-        <w:t>☐  Microsoft OneDrive / SharePoint</w:t>
+        <w:t xml:space="preserve">  Google Drive (recomendado) — carpeta compartida</w:t>
       </w:r>
     </w:p>
     <w:p>
@@ -929,18 +864,13 @@
         <w:rPr>
           <w:rFonts w:eastAsia="Calibri"/>
         </w:rPr>
-        <w:t>☐  Dropbox</w:t>
-      </w:r>
-    </w:p>
-    <w:p>
-      <w:pPr>
-        <w:spacing w:after="80"/>
-      </w:pPr>
+        <w:t>☐</w:t>
+      </w:r>
       <w:r>
         <w:rPr>
           <w:rFonts w:eastAsia="Calibri"/>
         </w:rPr>
-        <w:t>☐  WeTransfer / Smash (lotes puntuales de alta calidad)</w:t>
+        <w:t xml:space="preserve">  Microsoft OneDrive / SharePoint</w:t>
       </w:r>
     </w:p>
     <w:p>
@@ -951,7 +881,47 @@
         <w:rPr>
           <w:rFonts w:eastAsia="Calibri"/>
         </w:rPr>
-        <w:t>☐  Otro: ________________________________</w:t>
+        <w:t>☐</w:t>
+      </w:r>
+      <w:r>
+        <w:rPr>
+          <w:rFonts w:eastAsia="Calibri"/>
+        </w:rPr>
+        <w:t xml:space="preserve">  Dropbox</w:t>
+      </w:r>
+    </w:p>
+    <w:p>
+      <w:pPr>
+        <w:spacing w:after="80"/>
+      </w:pPr>
+      <w:r>
+        <w:rPr>
+          <w:rFonts w:eastAsia="Calibri"/>
+        </w:rPr>
+        <w:t>☐</w:t>
+      </w:r>
+      <w:r>
+        <w:rPr>
+          <w:rFonts w:eastAsia="Calibri"/>
+        </w:rPr>
+        <w:t xml:space="preserve">  WeTransfer / Smash (lotes puntuales de alta calidad)</w:t>
+      </w:r>
+    </w:p>
+    <w:p>
+      <w:pPr>
+        <w:spacing w:after="80"/>
+      </w:pPr>
+      <w:r>
+        <w:rPr>
+          <w:rFonts w:eastAsia="Calibri"/>
+        </w:rPr>
+        <w:t>☐</w:t>
+      </w:r>
+      <w:r>
+        <w:rPr>
+          <w:rFonts w:eastAsia="Calibri"/>
+        </w:rPr>
+        <w:t xml:space="preserve">  Otro: ________________________________</w:t>
       </w:r>
     </w:p>
     <w:p>
@@ -1000,21 +970,7 @@
         <w:rPr>
           <w:rFonts w:eastAsia="Calibri"/>
         </w:rPr>
-        <w:t xml:space="preserve">• /video_360/ → 1 video de </w:t>
-      </w:r>
-      <w:proofErr w:type="spellStart"/>
-      <w:r>
-        <w:rPr>
-          <w:rFonts w:eastAsia="Calibri"/>
-        </w:rPr>
-        <w:t>vuelta</w:t>
-      </w:r>
-      <w:proofErr w:type="spellEnd"/>
-      <w:r>
-        <w:rPr>
-          <w:rFonts w:eastAsia="Calibri"/>
-        </w:rPr>
-        <w:t xml:space="preserve"> completa (</w:t>
+        <w:t>• /video_360/ → 1 video de vuelta completa (</w:t>
       </w:r>
       <w:r>
         <w:rPr>
@@ -1045,7 +1001,6 @@
         <w:pStyle w:val="Ttulo2"/>
       </w:pPr>
       <w:r>
-        <w:lastRenderedPageBreak/>
         <w:t>3.3. Formatos y calidad mínima</w:t>
       </w:r>
     </w:p>
@@ -1635,18 +1590,13 @@
         <w:rPr>
           <w:rFonts w:eastAsia="Calibri"/>
         </w:rPr>
-        <w:t>☐  Opción 1: ________________________.cl</w:t>
-      </w:r>
-    </w:p>
-    <w:p>
-      <w:pPr>
-        <w:spacing w:after="80"/>
-      </w:pPr>
+        <w:t>☐</w:t>
+      </w:r>
       <w:r>
         <w:rPr>
           <w:rFonts w:eastAsia="Calibri"/>
         </w:rPr>
-        <w:t>☐  Opción 2: ________________________.cl</w:t>
+        <w:t xml:space="preserve">  Opción 1: ________________________.cl</w:t>
       </w:r>
     </w:p>
     <w:p>
@@ -1657,7 +1607,30 @@
         <w:rPr>
           <w:rFonts w:eastAsia="Calibri"/>
         </w:rPr>
-        <w:t>☐  Opción 3: ________________________.cl</w:t>
+        <w:t>☐</w:t>
+      </w:r>
+      <w:r>
+        <w:rPr>
+          <w:rFonts w:eastAsia="Calibri"/>
+        </w:rPr>
+        <w:t xml:space="preserve">  Opción 2: ________________________.cl</w:t>
+      </w:r>
+    </w:p>
+    <w:p>
+      <w:pPr>
+        <w:spacing w:after="80"/>
+      </w:pPr>
+      <w:r>
+        <w:rPr>
+          <w:rFonts w:eastAsia="Calibri"/>
+        </w:rPr>
+        <w:t>☐</w:t>
+      </w:r>
+      <w:r>
+        <w:rPr>
+          <w:rFonts w:eastAsia="Calibri"/>
+        </w:rPr>
+        <w:t xml:space="preserve">  Opción 3: ________________________.cl</w:t>
       </w:r>
     </w:p>
     <w:p>
@@ -1676,7 +1649,6 @@
         <w:pStyle w:val="Ttulo1"/>
       </w:pPr>
       <w:r>
-        <w:lastRenderedPageBreak/>
         <w:t>5. Elección de base de datos / backend de datos</w:t>
       </w:r>
     </w:p>
@@ -2288,18 +2260,13 @@
         <w:rPr>
           <w:rFonts w:eastAsia="Calibri"/>
         </w:rPr>
-        <w:t>☐  Supabase (recomendado)</w:t>
-      </w:r>
-    </w:p>
-    <w:p>
-      <w:pPr>
-        <w:spacing w:after="80"/>
-      </w:pPr>
+        <w:t>☐</w:t>
+      </w:r>
       <w:r>
         <w:rPr>
           <w:rFonts w:eastAsia="Calibri"/>
         </w:rPr>
-        <w:t>☐  Firebase</w:t>
+        <w:t xml:space="preserve">  Supabase (recomendado)</w:t>
       </w:r>
     </w:p>
     <w:p>
@@ -2310,7 +2277,30 @@
         <w:rPr>
           <w:rFonts w:eastAsia="Calibri"/>
         </w:rPr>
-        <w:t>☐  Otra: ________________________</w:t>
+        <w:t>☐</w:t>
+      </w:r>
+      <w:r>
+        <w:rPr>
+          <w:rFonts w:eastAsia="Calibri"/>
+        </w:rPr>
+        <w:t xml:space="preserve">  Firebase</w:t>
+      </w:r>
+    </w:p>
+    <w:p>
+      <w:pPr>
+        <w:spacing w:after="80"/>
+      </w:pPr>
+      <w:r>
+        <w:rPr>
+          <w:rFonts w:eastAsia="Calibri"/>
+        </w:rPr>
+        <w:t>☐</w:t>
+      </w:r>
+      <w:r>
+        <w:rPr>
+          <w:rFonts w:eastAsia="Calibri"/>
+        </w:rPr>
+        <w:t xml:space="preserve">  Otra: ________________________</w:t>
       </w:r>
     </w:p>
     <w:p>
@@ -2871,15 +2861,7 @@
                 <w:rFonts w:eastAsia="Calibri"/>
                 <w:sz w:val="18"/>
               </w:rPr>
-              <w:t xml:space="preserve">Quieren simplicidad y </w:t>
-            </w:r>
-            <w:r>
-              <w:rPr>
-                <w:rFonts w:eastAsia="Calibri"/>
-                <w:sz w:val="18"/>
-              </w:rPr>
-              <w:lastRenderedPageBreak/>
-              <w:t>velocidad</w:t>
+              <w:t>Quieren simplicidad y velocidad</w:t>
             </w:r>
           </w:p>
         </w:tc>
@@ -2897,7 +2879,6 @@
                 <w:rFonts w:eastAsia="Calibri"/>
                 <w:sz w:val="18"/>
               </w:rPr>
-              <w:lastRenderedPageBreak/>
               <w:t>Priorizan CDN global</w:t>
             </w:r>
           </w:p>
@@ -2916,15 +2897,7 @@
                 <w:rFonts w:eastAsia="Calibri"/>
                 <w:sz w:val="18"/>
               </w:rPr>
-              <w:t xml:space="preserve">Tienen administrador de </w:t>
-            </w:r>
-            <w:r>
-              <w:rPr>
-                <w:rFonts w:eastAsia="Calibri"/>
-                <w:sz w:val="18"/>
-              </w:rPr>
-              <w:lastRenderedPageBreak/>
-              <w:t>servidores</w:t>
+              <w:t>Tienen administrador de servidores</w:t>
             </w:r>
           </w:p>
         </w:tc>
@@ -2942,7 +2915,39 @@
           <w:color w:val="4A5568"/>
           <w:sz w:val="20"/>
         </w:rPr>
-        <w:t>Costo mensual estimado stack recomendado (Vercel Pro + Supabase Pro): ~US$45/mes + dominio anual.</w:t>
+        <w:t>Costo mensual estimado stack recomendado (</w:t>
+      </w:r>
+      <w:r>
+        <w:rPr>
+          <w:rFonts w:eastAsia="Calibri"/>
+          <w:color w:val="4A5568"/>
+          <w:sz w:val="20"/>
+        </w:rPr>
+        <w:t>Vercel Free Tier</w:t>
+      </w:r>
+      <w:r>
+        <w:rPr>
+          <w:rFonts w:eastAsia="Calibri"/>
+          <w:color w:val="4A5568"/>
+          <w:sz w:val="20"/>
+        </w:rPr>
+        <w:t xml:space="preserve"> + </w:t>
+      </w:r>
+      <w:r>
+        <w:rPr>
+          <w:rFonts w:eastAsia="Calibri"/>
+          <w:color w:val="4A5568"/>
+          <w:sz w:val="20"/>
+        </w:rPr>
+        <w:t>Supabase Free Tier (Postgres)</w:t>
+      </w:r>
+      <w:r>
+        <w:rPr>
+          <w:rFonts w:eastAsia="Calibri"/>
+          <w:color w:val="4A5568"/>
+          <w:sz w:val="20"/>
+        </w:rPr>
+        <w:t>): ~US$45/mes + dominio anual.</w:t>
       </w:r>
     </w:p>
     <w:p>
@@ -2961,29 +2966,59 @@
         <w:rPr>
           <w:rFonts w:eastAsia="Calibri"/>
         </w:rPr>
-        <w:t>☐  Vercel Pro (recomendado)</w:t>
-      </w:r>
-    </w:p>
-    <w:p>
-      <w:pPr>
-        <w:spacing w:after="80"/>
-      </w:pPr>
+        <w:t>☐</w:t>
+      </w:r>
       <w:r>
         <w:rPr>
           <w:rFonts w:eastAsia="Calibri"/>
         </w:rPr>
-        <w:t>☐  Cloudflare Pages</w:t>
-      </w:r>
-    </w:p>
-    <w:p>
-      <w:pPr>
-        <w:spacing w:after="80"/>
-      </w:pPr>
+        <w:t xml:space="preserve">  </w:t>
+      </w:r>
       <w:r>
         <w:rPr>
           <w:rFonts w:eastAsia="Calibri"/>
         </w:rPr>
-        <w:t>☐  VPS / otro: ________________________</w:t>
+        <w:t>Vercel Free Tier</w:t>
+      </w:r>
+      <w:r>
+        <w:rPr>
+          <w:rFonts w:eastAsia="Calibri"/>
+        </w:rPr>
+        <w:t xml:space="preserve"> (recomendado)</w:t>
+      </w:r>
+    </w:p>
+    <w:p>
+      <w:pPr>
+        <w:spacing w:after="80"/>
+      </w:pPr>
+      <w:r>
+        <w:rPr>
+          <w:rFonts w:eastAsia="Calibri"/>
+        </w:rPr>
+        <w:t>☐</w:t>
+      </w:r>
+      <w:r>
+        <w:rPr>
+          <w:rFonts w:eastAsia="Calibri"/>
+        </w:rPr>
+        <w:t xml:space="preserve">  Cloudflare Pages</w:t>
+      </w:r>
+    </w:p>
+    <w:p>
+      <w:pPr>
+        <w:spacing w:after="80"/>
+      </w:pPr>
+      <w:r>
+        <w:rPr>
+          <w:rFonts w:eastAsia="Calibri"/>
+        </w:rPr>
+        <w:t>☐</w:t>
+      </w:r>
+      <w:r>
+        <w:rPr>
+          <w:rFonts w:eastAsia="Calibri"/>
+        </w:rPr>
+        <w:t xml:space="preserve">  VPS / otro: ________________________</w:t>
       </w:r>
     </w:p>
     <w:p>
@@ -3099,18 +3134,13 @@
         <w:rPr>
           <w:rFonts w:eastAsia="Calibri"/>
         </w:rPr>
-        <w:t>☐  Autorizamos gestionar afiliación WebPay Plus con Transbank</w:t>
-      </w:r>
-    </w:p>
-    <w:p>
-      <w:pPr>
-        <w:spacing w:after="80"/>
-      </w:pPr>
+        <w:t>☐</w:t>
+      </w:r>
       <w:r>
         <w:rPr>
           <w:rFonts w:eastAsia="Calibri"/>
         </w:rPr>
-        <w:t>☐  Entregaremos código de comercio y credenciales de integración/producción</w:t>
+        <w:t xml:space="preserve">  Autorizamos gestionar afiliación WebPay Plus con Transbank</w:t>
       </w:r>
     </w:p>
     <w:p>
@@ -3121,18 +3151,47 @@
         <w:rPr>
           <w:rFonts w:eastAsia="Calibri"/>
         </w:rPr>
-        <w:t>☐  Designamos contacto interno Transbank: ________________________ / Tel: ____________</w:t>
-      </w:r>
-    </w:p>
-    <w:p>
-      <w:pPr>
-        <w:spacing w:after="80"/>
-      </w:pPr>
+        <w:t>☐</w:t>
+      </w:r>
       <w:r>
         <w:rPr>
           <w:rFonts w:eastAsia="Calibri"/>
         </w:rPr>
-        <w:t>☐  Por ahora NO incluimos pagos online en v1 (solo contacto/WhatsApp)</w:t>
+        <w:t xml:space="preserve">  Entregaremos código de comercio y credenciales de integración/producción</w:t>
+      </w:r>
+    </w:p>
+    <w:p>
+      <w:pPr>
+        <w:spacing w:after="80"/>
+      </w:pPr>
+      <w:r>
+        <w:rPr>
+          <w:rFonts w:eastAsia="Calibri"/>
+        </w:rPr>
+        <w:t>☐</w:t>
+      </w:r>
+      <w:r>
+        <w:rPr>
+          <w:rFonts w:eastAsia="Calibri"/>
+        </w:rPr>
+        <w:t xml:space="preserve">  Designamos contacto interno Transbank: ________________________ / Tel: ____________</w:t>
+      </w:r>
+    </w:p>
+    <w:p>
+      <w:pPr>
+        <w:spacing w:after="80"/>
+      </w:pPr>
+      <w:r>
+        <w:rPr>
+          <w:rFonts w:eastAsia="Calibri"/>
+        </w:rPr>
+        <w:t>☐</w:t>
+      </w:r>
+      <w:r>
+        <w:rPr>
+          <w:rFonts w:eastAsia="Calibri"/>
+        </w:rPr>
+        <w:t xml:space="preserve">  Por ahora NO incluimos pagos online en v1 (solo contacto/WhatsApp)</w:t>
       </w:r>
     </w:p>
     <w:p>
@@ -3170,18 +3229,13 @@
         <w:rPr>
           <w:rFonts w:eastAsia="Calibri"/>
         </w:rPr>
-        <w:t>☐  Indicar financiera(s) preferente(s): Forum / Otra: ____________</w:t>
-      </w:r>
-    </w:p>
-    <w:p>
-      <w:pPr>
-        <w:spacing w:after="80"/>
-      </w:pPr>
+        <w:t>☐</w:t>
+      </w:r>
       <w:r>
         <w:rPr>
           <w:rFonts w:eastAsia="Calibri"/>
         </w:rPr>
-        <w:t>☐  Entregar contacto del ejecutivo comercial de la financiera</w:t>
+        <w:t xml:space="preserve">  Indicar financiera(s) preferente(s): Forum / Otra: ____________</w:t>
       </w:r>
     </w:p>
     <w:p>
@@ -3192,19 +3246,47 @@
         <w:rPr>
           <w:rFonts w:eastAsia="Calibri"/>
         </w:rPr>
-        <w:t>☐  Consultar formalmente si existe API, link de cotización, iframe o flujo dealer</w:t>
-      </w:r>
-    </w:p>
-    <w:p>
-      <w:pPr>
-        <w:spacing w:after="80"/>
-      </w:pPr>
+        <w:t>☐</w:t>
+      </w:r>
       <w:r>
         <w:rPr>
           <w:rFonts w:eastAsia="Calibri"/>
         </w:rPr>
-        <w:lastRenderedPageBreak/>
-        <w:t>☐  Mientras no exista canal técnico: botón “Simular financiamiento” → WhatsApp / formulario / link externo</w:t>
+        <w:t xml:space="preserve">  Entregar contacto del ejecutivo comercial de la financiera</w:t>
+      </w:r>
+    </w:p>
+    <w:p>
+      <w:pPr>
+        <w:spacing w:after="80"/>
+      </w:pPr>
+      <w:r>
+        <w:rPr>
+          <w:rFonts w:eastAsia="Calibri"/>
+        </w:rPr>
+        <w:t>☐</w:t>
+      </w:r>
+      <w:r>
+        <w:rPr>
+          <w:rFonts w:eastAsia="Calibri"/>
+        </w:rPr>
+        <w:t xml:space="preserve">  Consultar formalmente si existe API, link de cotización, iframe o flujo dealer</w:t>
+      </w:r>
+    </w:p>
+    <w:p>
+      <w:pPr>
+        <w:spacing w:after="80"/>
+      </w:pPr>
+      <w:r>
+        <w:rPr>
+          <w:rFonts w:eastAsia="Calibri"/>
+        </w:rPr>
+        <w:t>☐</w:t>
+      </w:r>
+      <w:r>
+        <w:rPr>
+          <w:rFonts w:eastAsia="Calibri"/>
+        </w:rPr>
+        <w:t xml:space="preserve">  Mientras no exista canal técnico: botón “Simular financiamiento” → WhatsApp / formulario / link externo</w:t>
       </w:r>
     </w:p>
     <w:p>
@@ -3294,35 +3376,7 @@
         <w:rPr>
           <w:rFonts w:eastAsia="Calibri"/>
         </w:rPr>
-        <w:t xml:space="preserve">Se solicita devolver este documento firmado (o responder por correo con las casillas marcadas) en un </w:t>
-      </w:r>
-      <w:proofErr w:type="spellStart"/>
-      <w:r>
-        <w:rPr>
-          <w:rFonts w:eastAsia="Calibri"/>
-        </w:rPr>
-        <w:t>plazo</w:t>
-      </w:r>
-      <w:proofErr w:type="spellEnd"/>
-      <w:r>
-        <w:rPr>
-          <w:rFonts w:eastAsia="Calibri"/>
-        </w:rPr>
-        <w:t xml:space="preserve"> </w:t>
-      </w:r>
-      <w:proofErr w:type="spellStart"/>
-      <w:r>
-        <w:rPr>
-          <w:rFonts w:eastAsia="Calibri"/>
-        </w:rPr>
-        <w:t>máximo</w:t>
-      </w:r>
-      <w:proofErr w:type="spellEnd"/>
-      <w:r>
-        <w:rPr>
-          <w:rFonts w:eastAsia="Calibri"/>
-        </w:rPr>
-        <w:t xml:space="preserve"> de 1</w:t>
+        <w:t>Se solicita devolver este documento firmado (o responder por correo con las casillas marcadas) en un plazo máximo de 1</w:t>
       </w:r>
       <w:r>
         <w:rPr>
@@ -3334,21 +3388,7 @@
         <w:rPr>
           <w:rFonts w:eastAsia="Calibri"/>
         </w:rPr>
-        <w:t xml:space="preserve"> días </w:t>
-      </w:r>
-      <w:proofErr w:type="spellStart"/>
-      <w:r>
-        <w:rPr>
-          <w:rFonts w:eastAsia="Calibri"/>
-        </w:rPr>
-        <w:t>hábiles</w:t>
-      </w:r>
-      <w:proofErr w:type="spellEnd"/>
-      <w:r>
-        <w:rPr>
-          <w:rFonts w:eastAsia="Calibri"/>
-        </w:rPr>
-        <w:t>, a fin de no detener el cronograma del proyecto.</w:t>
+        <w:t xml:space="preserve"> días hábiles, a fin de no detener el cronograma del proyecto.</w:t>
       </w:r>
     </w:p>
     <w:p>
@@ -3730,53 +3770,7 @@
         <w:color w:val="4A5568"/>
         <w:sz w:val="18"/>
       </w:rPr>
-      <w:t>RG-PM-SOL-</w:t>
-    </w:r>
-    <w:proofErr w:type="gramStart"/>
-    <w:r>
-      <w:rPr>
-        <w:rFonts w:eastAsia="Calibri"/>
-        <w:color w:val="4A5568"/>
-        <w:sz w:val="18"/>
-      </w:rPr>
-      <w:t>001  ·</w:t>
-    </w:r>
-    <w:proofErr w:type="gramEnd"/>
-    <w:r>
-      <w:rPr>
-        <w:rFonts w:eastAsia="Calibri"/>
-        <w:color w:val="4A5568"/>
-        <w:sz w:val="18"/>
-      </w:rPr>
-      <w:t xml:space="preserve">  </w:t>
-    </w:r>
-    <w:proofErr w:type="spellStart"/>
-    <w:proofErr w:type="gramStart"/>
-    <w:r>
-      <w:rPr>
-        <w:rFonts w:eastAsia="Calibri"/>
-        <w:color w:val="4A5568"/>
-        <w:sz w:val="18"/>
-      </w:rPr>
-      <w:t>Confidencial</w:t>
-    </w:r>
-    <w:proofErr w:type="spellEnd"/>
-    <w:r>
-      <w:rPr>
-        <w:rFonts w:eastAsia="Calibri"/>
-        <w:color w:val="4A5568"/>
-        <w:sz w:val="18"/>
-      </w:rPr>
-      <w:t xml:space="preserve">  ·</w:t>
-    </w:r>
-    <w:proofErr w:type="gramEnd"/>
-    <w:r>
-      <w:rPr>
-        <w:rFonts w:eastAsia="Calibri"/>
-        <w:color w:val="4A5568"/>
-        <w:sz w:val="18"/>
-      </w:rPr>
-      <w:t xml:space="preserve">  Página </w:t>
+      <w:t xml:space="preserve">RG-PM-SOL-001  ·  Confidencial  ·  Página </w:t>
     </w:r>
     <w:r>
       <w:rPr>

</xml_diff>